<commit_message>
All Sufficient Merit lyrics: write out the chorus after Verse 3
Co-Authored-By: Claude Opus 5 <noreply@anthropic.com>
</commit_message>
<xml_diff>
--- a/songs/All Sufficient Merit.docx
+++ b/songs/All Sufficient Merit.docx
@@ -357,6 +357,58 @@
           <w:rFonts w:ascii="Verdana" w:hAnsi="Verdana"/>
         </w:rPr>
         <w:t xml:space="preserve"> x 2</w:t>
+      </w:r>
+    </w:p>
+    <w:p>
+      <w:pPr>
+        <w:rPr>
+          <w:rFonts w:ascii="Verdana" w:hAnsi="Verdana"/>
+        </w:rPr>
+      </w:pPr>
+      <w:r>
+        <w:rPr>
+          <w:rFonts w:ascii="Verdana" w:hAnsi="Verdana"/>
+        </w:rPr>
+        <w:t>It is done it is finished</w:t>
+      </w:r>
+    </w:p>
+    <w:p>
+      <w:pPr>
+        <w:rPr>
+          <w:rFonts w:ascii="Verdana" w:hAnsi="Verdana"/>
+        </w:rPr>
+      </w:pPr>
+      <w:r>
+        <w:rPr>
+          <w:rFonts w:ascii="Verdana" w:hAnsi="Verdana"/>
+        </w:rPr>
+        <w:t>No more debt I owe</w:t>
+      </w:r>
+    </w:p>
+    <w:p>
+      <w:pPr>
+        <w:rPr>
+          <w:rFonts w:ascii="Verdana" w:hAnsi="Verdana"/>
+        </w:rPr>
+      </w:pPr>
+      <w:r>
+        <w:rPr>
+          <w:rFonts w:ascii="Verdana" w:hAnsi="Verdana"/>
+        </w:rPr>
+        <w:t>Paid in full all sufficient</w:t>
+      </w:r>
+    </w:p>
+    <w:p>
+      <w:pPr>
+        <w:rPr>
+          <w:rFonts w:ascii="Verdana" w:hAnsi="Verdana"/>
+        </w:rPr>
+      </w:pPr>
+      <w:r>
+        <w:rPr>
+          <w:rFonts w:ascii="Verdana" w:hAnsi="Verdana"/>
+        </w:rPr>
+        <w:t>Merit now my own</w:t>
       </w:r>
     </w:p>
     <w:p>

</xml_diff>

<commit_message>
All Sufficient Merit lyrics: proper Chorus section after Verse 3, x2 written out
Co-Authored-By: Claude Opus 5 <noreply@anthropic.com>
</commit_message>
<xml_diff>
--- a/songs/All Sufficient Merit.docx
+++ b/songs/All Sufficient Merit.docx
@@ -352,11 +352,57 @@
         </w:rPr>
         <w:t>Chorus</w:t>
       </w:r>
-      <w:r>
-        <w:rPr>
-          <w:rFonts w:ascii="Verdana" w:hAnsi="Verdana"/>
-        </w:rPr>
-        <w:t xml:space="preserve"> x 2</w:t>
+    </w:p>
+    <w:p>
+      <w:pPr>
+        <w:rPr>
+          <w:rFonts w:ascii="Verdana" w:hAnsi="Verdana"/>
+        </w:rPr>
+      </w:pPr>
+      <w:r>
+        <w:rPr>
+          <w:rFonts w:ascii="Verdana" w:hAnsi="Verdana"/>
+        </w:rPr>
+        <w:t>It is done it is finished</w:t>
+      </w:r>
+    </w:p>
+    <w:p>
+      <w:pPr>
+        <w:rPr>
+          <w:rFonts w:ascii="Verdana" w:hAnsi="Verdana"/>
+        </w:rPr>
+      </w:pPr>
+      <w:r>
+        <w:rPr>
+          <w:rFonts w:ascii="Verdana" w:hAnsi="Verdana"/>
+        </w:rPr>
+        <w:t>No more debt I owe</w:t>
+      </w:r>
+    </w:p>
+    <w:p>
+      <w:pPr>
+        <w:rPr>
+          <w:rFonts w:ascii="Verdana" w:hAnsi="Verdana"/>
+        </w:rPr>
+      </w:pPr>
+      <w:r>
+        <w:rPr>
+          <w:rFonts w:ascii="Verdana" w:hAnsi="Verdana"/>
+        </w:rPr>
+        <w:t>Paid in full all sufficient</w:t>
+      </w:r>
+    </w:p>
+    <w:p>
+      <w:pPr>
+        <w:rPr>
+          <w:rFonts w:ascii="Verdana" w:hAnsi="Verdana"/>
+        </w:rPr>
+      </w:pPr>
+      <w:r>
+        <w:rPr>
+          <w:rFonts w:ascii="Verdana" w:hAnsi="Verdana"/>
+        </w:rPr>
+        <w:t>Merit now my own</w:t>
       </w:r>
     </w:p>
     <w:p>

</xml_diff>

<commit_message>
All Sufficient Merit lyrics: chorus after Verse 3 appears once
Co-Authored-By: Claude Opus 5 <noreply@anthropic.com>
</commit_message>
<xml_diff>
--- a/songs/All Sufficient Merit.docx
+++ b/songs/All Sufficient Merit.docx
@@ -351,58 +351,6 @@
           <w:rFonts w:ascii="Verdana" w:hAnsi="Verdana"/>
         </w:rPr>
         <w:t>Chorus</w:t>
-      </w:r>
-    </w:p>
-    <w:p>
-      <w:pPr>
-        <w:rPr>
-          <w:rFonts w:ascii="Verdana" w:hAnsi="Verdana"/>
-        </w:rPr>
-      </w:pPr>
-      <w:r>
-        <w:rPr>
-          <w:rFonts w:ascii="Verdana" w:hAnsi="Verdana"/>
-        </w:rPr>
-        <w:t>It is done it is finished</w:t>
-      </w:r>
-    </w:p>
-    <w:p>
-      <w:pPr>
-        <w:rPr>
-          <w:rFonts w:ascii="Verdana" w:hAnsi="Verdana"/>
-        </w:rPr>
-      </w:pPr>
-      <w:r>
-        <w:rPr>
-          <w:rFonts w:ascii="Verdana" w:hAnsi="Verdana"/>
-        </w:rPr>
-        <w:t>No more debt I owe</w:t>
-      </w:r>
-    </w:p>
-    <w:p>
-      <w:pPr>
-        <w:rPr>
-          <w:rFonts w:ascii="Verdana" w:hAnsi="Verdana"/>
-        </w:rPr>
-      </w:pPr>
-      <w:r>
-        <w:rPr>
-          <w:rFonts w:ascii="Verdana" w:hAnsi="Verdana"/>
-        </w:rPr>
-        <w:t>Paid in full all sufficient</w:t>
-      </w:r>
-    </w:p>
-    <w:p>
-      <w:pPr>
-        <w:rPr>
-          <w:rFonts w:ascii="Verdana" w:hAnsi="Verdana"/>
-        </w:rPr>
-      </w:pPr>
-      <w:r>
-        <w:rPr>
-          <w:rFonts w:ascii="Verdana" w:hAnsi="Verdana"/>
-        </w:rPr>
-        <w:t>Merit now my own</w:t>
       </w:r>
     </w:p>
     <w:p>

</xml_diff>